<commit_message>
Actualizar visus_garcia_victor_BD05_Tarea.docx, visus_garcia_victor_BD05_Tarea.pdf y visus_garcia_victor_BD05_Tarea.sql
</commit_message>
<xml_diff>
--- a/BD05B_TratamientoDeDatos-2023/visus_garcia_victor_BD05_Tarea.docx
+++ b/BD05B_TratamientoDeDatos-2023/visus_garcia_victor_BD05_Tarea.docx
@@ -51,7 +51,35 @@
         <w:rPr>
           <w:color w:val="7F7F7F" w:themeColor="text1" w:themeTint="80"/>
         </w:rPr>
-        <w:t>Inserta un registro nuevo en la tabla PROFESORADO utilizando la herramienta gráfica de sqldeveloper o la propia que ofrece Oracle Database Express. Los datos deben ser los siguientes:</w:t>
+        <w:t xml:space="preserve">Inserta un registro nuevo en la tabla PROFESORADO utilizando la herramienta gráfica de </w:t>
+      </w:r>
+      <w:proofErr w:type="spellStart"/>
+      <w:r>
+        <w:rPr>
+          <w:color w:val="7F7F7F" w:themeColor="text1" w:themeTint="80"/>
+        </w:rPr>
+        <w:t>sqldeveloper</w:t>
+      </w:r>
+      <w:proofErr w:type="spellEnd"/>
+      <w:r>
+        <w:rPr>
+          <w:color w:val="7F7F7F" w:themeColor="text1" w:themeTint="80"/>
+        </w:rPr>
+        <w:t xml:space="preserve"> o la propia que ofrece Oracle </w:t>
+      </w:r>
+      <w:proofErr w:type="spellStart"/>
+      <w:r>
+        <w:rPr>
+          <w:color w:val="7F7F7F" w:themeColor="text1" w:themeTint="80"/>
+        </w:rPr>
+        <w:t>Database</w:t>
+      </w:r>
+      <w:proofErr w:type="spellEnd"/>
+      <w:r>
+        <w:rPr>
+          <w:color w:val="7F7F7F" w:themeColor="text1" w:themeTint="80"/>
+        </w:rPr>
+        <w:t xml:space="preserve"> Express. Los datos deben ser los siguientes:</w:t>
       </w:r>
     </w:p>
     <w:p>
@@ -66,11 +94,19 @@
           <w:color w:val="7F7F7F" w:themeColor="text1" w:themeTint="80"/>
         </w:rPr>
       </w:pPr>
+      <w:proofErr w:type="spellStart"/>
       <w:r>
         <w:rPr>
           <w:color w:val="7F7F7F" w:themeColor="text1" w:themeTint="80"/>
         </w:rPr>
-        <w:t>Codigo: 1</w:t>
+        <w:t>Codigo</w:t>
+      </w:r>
+      <w:proofErr w:type="spellEnd"/>
+      <w:r>
+        <w:rPr>
+          <w:color w:val="7F7F7F" w:themeColor="text1" w:themeTint="80"/>
+        </w:rPr>
+        <w:t>: 1</w:t>
       </w:r>
     </w:p>
     <w:p>
@@ -161,11 +197,19 @@
           <w:color w:val="7F7F7F" w:themeColor="text1" w:themeTint="80"/>
         </w:rPr>
       </w:pPr>
+      <w:proofErr w:type="spellStart"/>
       <w:r>
         <w:rPr>
           <w:color w:val="7F7F7F" w:themeColor="text1" w:themeTint="80"/>
         </w:rPr>
-        <w:t>Fecha_Nac: 22/02/1972</w:t>
+        <w:t>Fecha_Nac</w:t>
+      </w:r>
+      <w:proofErr w:type="spellEnd"/>
+      <w:r>
+        <w:rPr>
+          <w:color w:val="7F7F7F" w:themeColor="text1" w:themeTint="80"/>
+        </w:rPr>
+        <w:t>: 22/02/1972</w:t>
       </w:r>
     </w:p>
     <w:p>
@@ -179,11 +223,19 @@
           <w:color w:val="7F7F7F" w:themeColor="text1" w:themeTint="80"/>
         </w:rPr>
       </w:pPr>
+      <w:proofErr w:type="spellStart"/>
       <w:r>
         <w:rPr>
           <w:color w:val="7F7F7F" w:themeColor="text1" w:themeTint="80"/>
         </w:rPr>
-        <w:t>Antiguedad: 9</w:t>
+        <w:t>Antiguedad</w:t>
+      </w:r>
+      <w:proofErr w:type="spellEnd"/>
+      <w:r>
+        <w:rPr>
+          <w:color w:val="7F7F7F" w:themeColor="text1" w:themeTint="80"/>
+        </w:rPr>
+        <w:t>: 9</w:t>
       </w:r>
     </w:p>
     <w:p>
@@ -559,6 +611,7 @@
                 <w:lang w:eastAsia="es-ES"/>
               </w:rPr>
             </w:pPr>
+            <w:proofErr w:type="spellStart"/>
             <w:r>
               <w:rPr>
                 <w:rFonts w:asciiTheme="majorHAnsi" w:eastAsia="Times New Roman" w:hAnsiTheme="majorHAnsi" w:cstheme="majorHAnsi"/>
@@ -571,6 +624,7 @@
               </w:rPr>
               <w:t>Codigo</w:t>
             </w:r>
+            <w:proofErr w:type="spellEnd"/>
           </w:p>
         </w:tc>
         <w:tc>
@@ -734,6 +788,7 @@
                 <w:lang w:eastAsia="es-ES"/>
               </w:rPr>
             </w:pPr>
+            <w:proofErr w:type="spellStart"/>
             <w:r>
               <w:rPr>
                 <w:rFonts w:asciiTheme="majorHAnsi" w:eastAsia="Times New Roman" w:hAnsiTheme="majorHAnsi" w:cstheme="majorHAnsi"/>
@@ -746,6 +801,7 @@
               </w:rPr>
               <w:t>Fecha_Nac</w:t>
             </w:r>
+            <w:proofErr w:type="spellEnd"/>
           </w:p>
         </w:tc>
         <w:tc>
@@ -769,6 +825,7 @@
                 <w:lang w:eastAsia="es-ES"/>
               </w:rPr>
             </w:pPr>
+            <w:proofErr w:type="spellStart"/>
             <w:r>
               <w:rPr>
                 <w:rFonts w:asciiTheme="majorHAnsi" w:eastAsia="Times New Roman" w:hAnsiTheme="majorHAnsi" w:cstheme="majorHAnsi"/>
@@ -781,6 +838,7 @@
               </w:rPr>
               <w:t>Antiguedad</w:t>
             </w:r>
+            <w:proofErr w:type="spellEnd"/>
           </w:p>
         </w:tc>
       </w:tr>
@@ -1812,20 +1870,104 @@
         <w:rPr>
           <w:rFonts w:ascii="Courier New" w:hAnsi="Courier New" w:cs="Courier New"/>
         </w:rPr>
-        <w:t>INSERT INTO profesorado (codigo, nombre, apellidos, dni, especialidad, fecha_nac, antiguedad) VALUES (2, 'NEREA', 'FABRE BERDUN', '51083099F', 'TECNOLOGIA', '31/03/1975',4);</w:t>
-      </w:r>
-    </w:p>
-    <w:p>
-      <w:pPr>
-        <w:rPr>
-          <w:rFonts w:ascii="Courier New" w:hAnsi="Courier New" w:cs="Courier New"/>
-        </w:rPr>
-      </w:pPr>
-      <w:r>
-        <w:rPr>
-          <w:rFonts w:ascii="Courier New" w:hAnsi="Courier New" w:cs="Courier New"/>
-        </w:rPr>
-        <w:t>INSERT INTO profesorado (codigo, nombre, apellidos, especialidad, fecha_nac)</w:t>
+        <w:t>INSERT INTO profesorado (</w:t>
+      </w:r>
+      <w:proofErr w:type="spellStart"/>
+      <w:r>
+        <w:rPr>
+          <w:rFonts w:ascii="Courier New" w:hAnsi="Courier New" w:cs="Courier New"/>
+        </w:rPr>
+        <w:t>codigo</w:t>
+      </w:r>
+      <w:proofErr w:type="spellEnd"/>
+      <w:r>
+        <w:rPr>
+          <w:rFonts w:ascii="Courier New" w:hAnsi="Courier New" w:cs="Courier New"/>
+        </w:rPr>
+        <w:t xml:space="preserve">, nombre, apellidos, </w:t>
+      </w:r>
+      <w:proofErr w:type="spellStart"/>
+      <w:r>
+        <w:rPr>
+          <w:rFonts w:ascii="Courier New" w:hAnsi="Courier New" w:cs="Courier New"/>
+        </w:rPr>
+        <w:t>dni</w:t>
+      </w:r>
+      <w:proofErr w:type="spellEnd"/>
+      <w:r>
+        <w:rPr>
+          <w:rFonts w:ascii="Courier New" w:hAnsi="Courier New" w:cs="Courier New"/>
+        </w:rPr>
+        <w:t xml:space="preserve">, especialidad, </w:t>
+      </w:r>
+      <w:proofErr w:type="spellStart"/>
+      <w:r>
+        <w:rPr>
+          <w:rFonts w:ascii="Courier New" w:hAnsi="Courier New" w:cs="Courier New"/>
+        </w:rPr>
+        <w:t>fecha_nac</w:t>
+      </w:r>
+      <w:proofErr w:type="spellEnd"/>
+      <w:r>
+        <w:rPr>
+          <w:rFonts w:ascii="Courier New" w:hAnsi="Courier New" w:cs="Courier New"/>
+        </w:rPr>
+        <w:t xml:space="preserve">, </w:t>
+      </w:r>
+      <w:proofErr w:type="spellStart"/>
+      <w:r>
+        <w:rPr>
+          <w:rFonts w:ascii="Courier New" w:hAnsi="Courier New" w:cs="Courier New"/>
+        </w:rPr>
+        <w:t>antiguedad</w:t>
+      </w:r>
+      <w:proofErr w:type="spellEnd"/>
+      <w:r>
+        <w:rPr>
+          <w:rFonts w:ascii="Courier New" w:hAnsi="Courier New" w:cs="Courier New"/>
+        </w:rPr>
+        <w:t>) VALUES (2, 'NEREA', 'FABRE BERDUN', '51083099F', 'TECNOLOGIA', '31/03/1975',4);</w:t>
+      </w:r>
+    </w:p>
+    <w:p>
+      <w:pPr>
+        <w:rPr>
+          <w:rFonts w:ascii="Courier New" w:hAnsi="Courier New" w:cs="Courier New"/>
+        </w:rPr>
+      </w:pPr>
+      <w:r>
+        <w:rPr>
+          <w:rFonts w:ascii="Courier New" w:hAnsi="Courier New" w:cs="Courier New"/>
+        </w:rPr>
+        <w:t>INSERT INTO profesorado (</w:t>
+      </w:r>
+      <w:proofErr w:type="spellStart"/>
+      <w:r>
+        <w:rPr>
+          <w:rFonts w:ascii="Courier New" w:hAnsi="Courier New" w:cs="Courier New"/>
+        </w:rPr>
+        <w:t>codigo</w:t>
+      </w:r>
+      <w:proofErr w:type="spellEnd"/>
+      <w:r>
+        <w:rPr>
+          <w:rFonts w:ascii="Courier New" w:hAnsi="Courier New" w:cs="Courier New"/>
+        </w:rPr>
+        <w:t xml:space="preserve">, nombre, apellidos, especialidad, </w:t>
+      </w:r>
+      <w:proofErr w:type="spellStart"/>
+      <w:r>
+        <w:rPr>
+          <w:rFonts w:ascii="Courier New" w:hAnsi="Courier New" w:cs="Courier New"/>
+        </w:rPr>
+        <w:t>fecha_nac</w:t>
+      </w:r>
+      <w:proofErr w:type="spellEnd"/>
+      <w:r>
+        <w:rPr>
+          <w:rFonts w:ascii="Courier New" w:hAnsi="Courier New" w:cs="Courier New"/>
+        </w:rPr>
+        <w:t>)</w:t>
       </w:r>
       <w:r>
         <w:rPr>
@@ -1850,7 +1992,63 @@
         <w:rPr>
           <w:rFonts w:ascii="Courier New" w:hAnsi="Courier New" w:cs="Courier New"/>
         </w:rPr>
-        <w:t>INSERT INTO profesorado (codigo, nombre, apellidos, dni, especialidad, fecha_nac, antiguedad)</w:t>
+        <w:t>INSERT INTO profesorado (</w:t>
+      </w:r>
+      <w:proofErr w:type="spellStart"/>
+      <w:r>
+        <w:rPr>
+          <w:rFonts w:ascii="Courier New" w:hAnsi="Courier New" w:cs="Courier New"/>
+        </w:rPr>
+        <w:t>codigo</w:t>
+      </w:r>
+      <w:proofErr w:type="spellEnd"/>
+      <w:r>
+        <w:rPr>
+          <w:rFonts w:ascii="Courier New" w:hAnsi="Courier New" w:cs="Courier New"/>
+        </w:rPr>
+        <w:t xml:space="preserve">, nombre, apellidos, </w:t>
+      </w:r>
+      <w:proofErr w:type="spellStart"/>
+      <w:r>
+        <w:rPr>
+          <w:rFonts w:ascii="Courier New" w:hAnsi="Courier New" w:cs="Courier New"/>
+        </w:rPr>
+        <w:t>dni</w:t>
+      </w:r>
+      <w:proofErr w:type="spellEnd"/>
+      <w:r>
+        <w:rPr>
+          <w:rFonts w:ascii="Courier New" w:hAnsi="Courier New" w:cs="Courier New"/>
+        </w:rPr>
+        <w:t xml:space="preserve">, especialidad, </w:t>
+      </w:r>
+      <w:proofErr w:type="spellStart"/>
+      <w:r>
+        <w:rPr>
+          <w:rFonts w:ascii="Courier New" w:hAnsi="Courier New" w:cs="Courier New"/>
+        </w:rPr>
+        <w:t>fecha_nac</w:t>
+      </w:r>
+      <w:proofErr w:type="spellEnd"/>
+      <w:r>
+        <w:rPr>
+          <w:rFonts w:ascii="Courier New" w:hAnsi="Courier New" w:cs="Courier New"/>
+        </w:rPr>
+        <w:t xml:space="preserve">, </w:t>
+      </w:r>
+      <w:proofErr w:type="spellStart"/>
+      <w:r>
+        <w:rPr>
+          <w:rFonts w:ascii="Courier New" w:hAnsi="Courier New" w:cs="Courier New"/>
+        </w:rPr>
+        <w:t>antiguedad</w:t>
+      </w:r>
+      <w:proofErr w:type="spellEnd"/>
+      <w:r>
+        <w:rPr>
+          <w:rFonts w:ascii="Courier New" w:hAnsi="Courier New" w:cs="Courier New"/>
+        </w:rPr>
+        <w:t>)</w:t>
       </w:r>
       <w:r>
         <w:rPr>
@@ -1875,7 +2073,49 @@
         <w:rPr>
           <w:rFonts w:ascii="Courier New" w:hAnsi="Courier New" w:cs="Courier New"/>
         </w:rPr>
-        <w:t>INSERT INTO profesorado (codigo, nombre, apellidos, especialidad, fecha_nac, antiguedad)</w:t>
+        <w:t>INSERT INTO profesorado (</w:t>
+      </w:r>
+      <w:proofErr w:type="spellStart"/>
+      <w:r>
+        <w:rPr>
+          <w:rFonts w:ascii="Courier New" w:hAnsi="Courier New" w:cs="Courier New"/>
+        </w:rPr>
+        <w:t>codigo</w:t>
+      </w:r>
+      <w:proofErr w:type="spellEnd"/>
+      <w:r>
+        <w:rPr>
+          <w:rFonts w:ascii="Courier New" w:hAnsi="Courier New" w:cs="Courier New"/>
+        </w:rPr>
+        <w:t xml:space="preserve">, nombre, apellidos, especialidad, </w:t>
+      </w:r>
+      <w:proofErr w:type="spellStart"/>
+      <w:r>
+        <w:rPr>
+          <w:rFonts w:ascii="Courier New" w:hAnsi="Courier New" w:cs="Courier New"/>
+        </w:rPr>
+        <w:t>fecha_nac</w:t>
+      </w:r>
+      <w:proofErr w:type="spellEnd"/>
+      <w:r>
+        <w:rPr>
+          <w:rFonts w:ascii="Courier New" w:hAnsi="Courier New" w:cs="Courier New"/>
+        </w:rPr>
+        <w:t xml:space="preserve">, </w:t>
+      </w:r>
+      <w:proofErr w:type="spellStart"/>
+      <w:r>
+        <w:rPr>
+          <w:rFonts w:ascii="Courier New" w:hAnsi="Courier New" w:cs="Courier New"/>
+        </w:rPr>
+        <w:t>antiguedad</w:t>
+      </w:r>
+      <w:proofErr w:type="spellEnd"/>
+      <w:r>
+        <w:rPr>
+          <w:rFonts w:ascii="Courier New" w:hAnsi="Courier New" w:cs="Courier New"/>
+        </w:rPr>
+        <w:t>)</w:t>
       </w:r>
       <w:r>
         <w:rPr>
@@ -2109,6 +2349,7 @@
                 <w:lang w:eastAsia="es-ES"/>
               </w:rPr>
             </w:pPr>
+            <w:proofErr w:type="spellStart"/>
             <w:r>
               <w:rPr>
                 <w:rFonts w:asciiTheme="majorHAnsi" w:eastAsia="Times New Roman" w:hAnsiTheme="majorHAnsi" w:cstheme="majorHAnsi"/>
@@ -2121,6 +2362,7 @@
               </w:rPr>
               <w:t>Codigo</w:t>
             </w:r>
+            <w:proofErr w:type="spellEnd"/>
           </w:p>
         </w:tc>
         <w:tc>
@@ -2144,6 +2386,7 @@
                 <w:lang w:eastAsia="es-ES"/>
               </w:rPr>
             </w:pPr>
+            <w:proofErr w:type="spellStart"/>
             <w:r>
               <w:rPr>
                 <w:rFonts w:asciiTheme="majorHAnsi" w:eastAsia="Times New Roman" w:hAnsiTheme="majorHAnsi" w:cstheme="majorHAnsi"/>
@@ -2156,6 +2399,7 @@
               </w:rPr>
               <w:t>Cod_Profe</w:t>
             </w:r>
+            <w:proofErr w:type="spellEnd"/>
           </w:p>
         </w:tc>
       </w:tr>
@@ -3042,7 +3286,35 @@
         <w:rPr>
           <w:rFonts w:ascii="Courier New" w:hAnsi="Courier New" w:cs="Courier New"/>
         </w:rPr>
-        <w:t>UPDATE profesorado SET fecha_nac = '22/06/1974', antiguedad = 4</w:t>
+        <w:t xml:space="preserve">UPDATE profesorado SET </w:t>
+      </w:r>
+      <w:proofErr w:type="spellStart"/>
+      <w:r>
+        <w:rPr>
+          <w:rFonts w:ascii="Courier New" w:hAnsi="Courier New" w:cs="Courier New"/>
+        </w:rPr>
+        <w:t>fecha_nac</w:t>
+      </w:r>
+      <w:proofErr w:type="spellEnd"/>
+      <w:r>
+        <w:rPr>
+          <w:rFonts w:ascii="Courier New" w:hAnsi="Courier New" w:cs="Courier New"/>
+        </w:rPr>
+        <w:t xml:space="preserve"> = '22/06/1974', </w:t>
+      </w:r>
+      <w:proofErr w:type="spellStart"/>
+      <w:r>
+        <w:rPr>
+          <w:rFonts w:ascii="Courier New" w:hAnsi="Courier New" w:cs="Courier New"/>
+        </w:rPr>
+        <w:t>antiguedad</w:t>
+      </w:r>
+      <w:proofErr w:type="spellEnd"/>
+      <w:r>
+        <w:rPr>
+          <w:rFonts w:ascii="Courier New" w:hAnsi="Courier New" w:cs="Courier New"/>
+        </w:rPr>
+        <w:t xml:space="preserve"> = 4</w:t>
       </w:r>
     </w:p>
     <w:p>
@@ -3057,7 +3329,21 @@
         <w:rPr>
           <w:rFonts w:ascii="Courier New" w:hAnsi="Courier New" w:cs="Courier New"/>
         </w:rPr>
-        <w:t>WHERE UPPER(nombre) = 'BELEN';</w:t>
+        <w:t xml:space="preserve">WHERE </w:t>
+      </w:r>
+      <w:proofErr w:type="gramStart"/>
+      <w:r>
+        <w:rPr>
+          <w:rFonts w:ascii="Courier New" w:hAnsi="Courier New" w:cs="Courier New"/>
+        </w:rPr>
+        <w:t>UPPER(</w:t>
+      </w:r>
+      <w:proofErr w:type="gramEnd"/>
+      <w:r>
+        <w:rPr>
+          <w:rFonts w:ascii="Courier New" w:hAnsi="Courier New" w:cs="Courier New"/>
+        </w:rPr>
+        <w:t>nombre) = 'BELEN';</w:t>
       </w:r>
     </w:p>
     <w:p>
@@ -3254,7 +3540,35 @@
         <w:rPr>
           <w:rFonts w:ascii="Courier New" w:hAnsi="Courier New" w:cs="Courier New"/>
         </w:rPr>
-        <w:t>UPDATE profesorado SET antiguedad = (COALESCE(antiguedad,0) + 3);</w:t>
+        <w:t xml:space="preserve">UPDATE profesorado SET </w:t>
+      </w:r>
+      <w:proofErr w:type="spellStart"/>
+      <w:r>
+        <w:rPr>
+          <w:rFonts w:ascii="Courier New" w:hAnsi="Courier New" w:cs="Courier New"/>
+        </w:rPr>
+        <w:t>antiguedad</w:t>
+      </w:r>
+      <w:proofErr w:type="spellEnd"/>
+      <w:r>
+        <w:rPr>
+          <w:rFonts w:ascii="Courier New" w:hAnsi="Courier New" w:cs="Courier New"/>
+        </w:rPr>
+        <w:t xml:space="preserve"> = (</w:t>
+      </w:r>
+      <w:proofErr w:type="gramStart"/>
+      <w:r>
+        <w:rPr>
+          <w:rFonts w:ascii="Courier New" w:hAnsi="Courier New" w:cs="Courier New"/>
+        </w:rPr>
+        <w:t>COALESCE(</w:t>
+      </w:r>
+      <w:proofErr w:type="gramEnd"/>
+      <w:r>
+        <w:rPr>
+          <w:rFonts w:ascii="Courier New" w:hAnsi="Courier New" w:cs="Courier New"/>
+        </w:rPr>
+        <w:t>antiguedad,0) + 3);</w:t>
       </w:r>
     </w:p>
     <w:p>
@@ -3792,7 +4106,21 @@
         <w:rPr>
           <w:rFonts w:ascii="Courier New" w:hAnsi="Courier New" w:cs="Courier New"/>
         </w:rPr>
-        <w:t>DELETE FROM alumnado WHERE cod_curso = 3;</w:t>
+        <w:t xml:space="preserve">DELETE FROM alumnado WHERE </w:t>
+      </w:r>
+      <w:proofErr w:type="spellStart"/>
+      <w:r>
+        <w:rPr>
+          <w:rFonts w:ascii="Courier New" w:hAnsi="Courier New" w:cs="Courier New"/>
+        </w:rPr>
+        <w:t>cod_curso</w:t>
+      </w:r>
+      <w:proofErr w:type="spellEnd"/>
+      <w:r>
+        <w:rPr>
+          <w:rFonts w:ascii="Courier New" w:hAnsi="Courier New" w:cs="Courier New"/>
+        </w:rPr>
+        <w:t xml:space="preserve"> = 3;</w:t>
       </w:r>
     </w:p>
     <w:p>
@@ -3850,7 +4178,7 @@
         <mc:AlternateContent>
           <mc:Choice Requires="wps">
             <w:drawing>
-              <wp:anchor distT="0" distB="0" distL="114300" distR="114300" simplePos="0" relativeHeight="251673600" behindDoc="1" locked="0" layoutInCell="1" allowOverlap="1" wp14:anchorId="61FD361A" wp14:editId="12D83501">
+              <wp:anchor distT="0" distB="0" distL="114300" distR="114300" simplePos="0" relativeHeight="251673600" behindDoc="1" locked="0" layoutInCell="1" allowOverlap="1" wp14:anchorId="61FD361A" wp14:editId="67AAA96E">
                 <wp:simplePos x="0" y="0"/>
                 <wp:positionH relativeFrom="page">
                   <wp:align>left</wp:align>
@@ -3858,7 +4186,7 @@
                 <wp:positionV relativeFrom="paragraph">
                   <wp:posOffset>33655</wp:posOffset>
                 </wp:positionV>
-                <wp:extent cx="7572375" cy="1333500"/>
+                <wp:extent cx="7572375" cy="1485900"/>
                 <wp:effectExtent l="0" t="0" r="28575" b="19050"/>
                 <wp:wrapNone/>
                 <wp:docPr id="11" name="Rectángulo 11"/>
@@ -3870,7 +4198,7 @@
                       <wps:spPr>
                         <a:xfrm>
                           <a:off x="0" y="0"/>
-                          <a:ext cx="7572375" cy="1333500"/>
+                          <a:ext cx="7572375" cy="1485900"/>
                         </a:xfrm>
                         <a:prstGeom prst="rect">
                           <a:avLst/>
@@ -3922,7 +4250,7 @@
           </mc:Choice>
           <mc:Fallback>
             <w:pict>
-              <v:rect w14:anchorId="43D25670" id="Rectángulo 11" o:spid="_x0000_s1026" style="position:absolute;margin-left:0;margin-top:2.65pt;width:596.25pt;height:105pt;z-index:-251642880;visibility:visible;mso-wrap-style:square;mso-width-percent:0;mso-height-percent:0;mso-wrap-distance-left:9pt;mso-wrap-distance-top:0;mso-wrap-distance-right:9pt;mso-wrap-distance-bottom:0;mso-position-horizontal:left;mso-position-horizontal-relative:page;mso-position-vertical:absolute;mso-position-vertical-relative:text;mso-width-percent:0;mso-height-percent:0;mso-width-relative:margin;mso-height-relative:margin;v-text-anchor:middle" o:gfxdata="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" fillcolor="#f2f2f2 [3052]" strokecolor="black [3213]" strokeweight="1pt">
+              <v:rect w14:anchorId="41D62957" id="Rectángulo 11" o:spid="_x0000_s1026" style="position:absolute;margin-left:0;margin-top:2.65pt;width:596.25pt;height:117pt;z-index:-251642880;visibility:visible;mso-wrap-style:square;mso-width-percent:0;mso-height-percent:0;mso-wrap-distance-left:9pt;mso-wrap-distance-top:0;mso-wrap-distance-right:9pt;mso-wrap-distance-bottom:0;mso-position-horizontal:left;mso-position-horizontal-relative:page;mso-position-vertical:absolute;mso-position-vertical-relative:text;mso-width-percent:0;mso-height-percent:0;mso-width-relative:margin;mso-height-relative:margin;v-text-anchor:middle" o:gfxdata="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" fillcolor="#f2f2f2 [3052]" strokecolor="black [3213]" strokeweight="1pt">
                 <w10:wrap anchorx="page"/>
               </v:rect>
             </w:pict>
@@ -3982,7 +4310,21 @@
         <w:rPr>
           <w:rFonts w:ascii="Courier New" w:hAnsi="Courier New" w:cs="Courier New"/>
         </w:rPr>
-        <w:t>INSERT INTO alumnado (nombre, apellidos, sexo, fecha_nac)</w:t>
+        <w:t xml:space="preserve">INSERT INTO alumnado (nombre, apellidos, sexo, </w:t>
+      </w:r>
+      <w:proofErr w:type="spellStart"/>
+      <w:r>
+        <w:rPr>
+          <w:rFonts w:ascii="Courier New" w:hAnsi="Courier New" w:cs="Courier New"/>
+        </w:rPr>
+        <w:t>fecha_nac</w:t>
+      </w:r>
+      <w:proofErr w:type="spellEnd"/>
+      <w:r>
+        <w:rPr>
+          <w:rFonts w:ascii="Courier New" w:hAnsi="Courier New" w:cs="Courier New"/>
+        </w:rPr>
+        <w:t>)</w:t>
       </w:r>
     </w:p>
     <w:p>
@@ -3996,13 +4338,36 @@
         <w:rPr>
           <w:rFonts w:ascii="Courier New" w:hAnsi="Courier New" w:cs="Courier New"/>
         </w:rPr>
-        <w:t xml:space="preserve">    SELECT nombre, apellidos, sexo, fecha_nac FROM alumnado_nuevo;</w:t>
-      </w:r>
-    </w:p>
-    <w:p>
-      <w:pPr>
-        <w:spacing w:line="240" w:lineRule="auto"/>
-      </w:pPr>
+        <w:t xml:space="preserve">    SELECT nombre, apellidos, sexo, </w:t>
+      </w:r>
+      <w:proofErr w:type="spellStart"/>
+      <w:r>
+        <w:rPr>
+          <w:rFonts w:ascii="Courier New" w:hAnsi="Courier New" w:cs="Courier New"/>
+        </w:rPr>
+        <w:t>fecha_nac</w:t>
+      </w:r>
+      <w:proofErr w:type="spellEnd"/>
+      <w:r>
+        <w:rPr>
+          <w:rFonts w:ascii="Courier New" w:hAnsi="Courier New" w:cs="Courier New"/>
+        </w:rPr>
+        <w:t xml:space="preserve"> FROM </w:t>
+      </w:r>
+      <w:proofErr w:type="spellStart"/>
+      <w:r>
+        <w:rPr>
+          <w:rFonts w:ascii="Courier New" w:hAnsi="Courier New" w:cs="Courier New"/>
+        </w:rPr>
+        <w:t>alumnado_nuevo</w:t>
+      </w:r>
+      <w:proofErr w:type="spellEnd"/>
+      <w:r>
+        <w:rPr>
+          <w:rFonts w:ascii="Courier New" w:hAnsi="Courier New" w:cs="Courier New"/>
+        </w:rPr>
+        <w:t>;</w:t>
+      </w:r>
     </w:p>
     <w:p>
       <w:pPr>
@@ -4024,10 +4389,279 @@
         <w:spacing w:line="240" w:lineRule="auto"/>
         <w:ind w:left="714" w:hanging="357"/>
         <w:contextualSpacing w:val="0"/>
-      </w:pPr>
-      <w:r>
-        <w:t>En la tabla CURSOS, actualiza el campo Max_Alumn del registro del curso con código 2, asignándole el valor correspondiente al número total de alumnos y alumnas que hay en la tabla ALUMNADO y que tienen asignado ese mismo curso.</w:t>
-      </w:r>
+        <w:rPr>
+          <w:color w:val="7F7F7F" w:themeColor="text1" w:themeTint="80"/>
+        </w:rPr>
+      </w:pPr>
+      <w:r>
+        <w:rPr>
+          <w:color w:val="7F7F7F" w:themeColor="text1" w:themeTint="80"/>
+        </w:rPr>
+        <w:t xml:space="preserve">En la tabla CURSOS, actualiza el campo </w:t>
+      </w:r>
+      <w:proofErr w:type="spellStart"/>
+      <w:r>
+        <w:rPr>
+          <w:color w:val="7F7F7F" w:themeColor="text1" w:themeTint="80"/>
+        </w:rPr>
+        <w:t>Max_Alumn</w:t>
+      </w:r>
+      <w:proofErr w:type="spellEnd"/>
+      <w:r>
+        <w:rPr>
+          <w:color w:val="7F7F7F" w:themeColor="text1" w:themeTint="80"/>
+        </w:rPr>
+        <w:t xml:space="preserve"> del registro del curso con código 2, asignándole el valor correspondiente al número total de alumnos y alumnas que hay en la tabla ALUMNADO y que tienen asignado ese mismo curso.</w:t>
+      </w:r>
+    </w:p>
+    <w:p>
+      <w:pPr>
+        <w:pStyle w:val="Prrafodelista"/>
+        <w:spacing w:line="240" w:lineRule="auto"/>
+      </w:pPr>
+      <w:r>
+        <w:rPr>
+          <w:noProof/>
+        </w:rPr>
+        <mc:AlternateContent>
+          <mc:Choice Requires="wps">
+            <w:drawing>
+              <wp:anchor distT="0" distB="0" distL="114300" distR="114300" simplePos="0" relativeHeight="251675648" behindDoc="1" locked="0" layoutInCell="1" allowOverlap="1" wp14:anchorId="7727CA86" wp14:editId="76FBDEEB">
+                <wp:simplePos x="0" y="0"/>
+                <wp:positionH relativeFrom="page">
+                  <wp:align>left</wp:align>
+                </wp:positionH>
+                <wp:positionV relativeFrom="paragraph">
+                  <wp:posOffset>33655</wp:posOffset>
+                </wp:positionV>
+                <wp:extent cx="7572375" cy="1609725"/>
+                <wp:effectExtent l="0" t="0" r="28575" b="28575"/>
+                <wp:wrapNone/>
+                <wp:docPr id="15" name="Rectángulo 15"/>
+                <wp:cNvGraphicFramePr/>
+                <a:graphic xmlns:a="http://schemas.openxmlformats.org/drawingml/2006/main">
+                  <a:graphicData uri="http://schemas.microsoft.com/office/word/2010/wordprocessingShape">
+                    <wps:wsp>
+                      <wps:cNvSpPr/>
+                      <wps:spPr>
+                        <a:xfrm>
+                          <a:off x="0" y="0"/>
+                          <a:ext cx="7572375" cy="1609725"/>
+                        </a:xfrm>
+                        <a:prstGeom prst="rect">
+                          <a:avLst/>
+                        </a:prstGeom>
+                        <a:solidFill>
+                          <a:schemeClr val="bg1">
+                            <a:lumMod val="95000"/>
+                          </a:schemeClr>
+                        </a:solidFill>
+                        <a:ln cmpd="sng">
+                          <a:solidFill>
+                            <a:schemeClr val="tx1"/>
+                          </a:solidFill>
+                        </a:ln>
+                      </wps:spPr>
+                      <wps:style>
+                        <a:lnRef idx="2">
+                          <a:schemeClr val="accent1">
+                            <a:shade val="50000"/>
+                          </a:schemeClr>
+                        </a:lnRef>
+                        <a:fillRef idx="1">
+                          <a:schemeClr val="accent1"/>
+                        </a:fillRef>
+                        <a:effectRef idx="0">
+                          <a:schemeClr val="accent1"/>
+                        </a:effectRef>
+                        <a:fontRef idx="minor">
+                          <a:schemeClr val="lt1"/>
+                        </a:fontRef>
+                      </wps:style>
+                      <wps:bodyPr rot="0" spcFirstLastPara="0" vertOverflow="overflow" horzOverflow="overflow" vert="horz" wrap="square" lIns="91440" tIns="45720" rIns="91440" bIns="45720" numCol="1" spcCol="0" rtlCol="0" fromWordArt="0" anchor="ctr" anchorCtr="0" forceAA="0" compatLnSpc="1">
+                        <a:prstTxWarp prst="textNoShape">
+                          <a:avLst/>
+                        </a:prstTxWarp>
+                        <a:noAutofit/>
+                      </wps:bodyPr>
+                    </wps:wsp>
+                  </a:graphicData>
+                </a:graphic>
+                <wp14:sizeRelH relativeFrom="margin">
+                  <wp14:pctWidth>0</wp14:pctWidth>
+                </wp14:sizeRelH>
+                <wp14:sizeRelV relativeFrom="margin">
+                  <wp14:pctHeight>0</wp14:pctHeight>
+                </wp14:sizeRelV>
+              </wp:anchor>
+            </w:drawing>
+          </mc:Choice>
+          <mc:Fallback>
+            <w:pict>
+              <v:rect w14:anchorId="422A0EFC" id="Rectángulo 15" o:spid="_x0000_s1026" style="position:absolute;margin-left:0;margin-top:2.65pt;width:596.25pt;height:126.75pt;z-index:-251640832;visibility:visible;mso-wrap-style:square;mso-width-percent:0;mso-height-percent:0;mso-wrap-distance-left:9pt;mso-wrap-distance-top:0;mso-wrap-distance-right:9pt;mso-wrap-distance-bottom:0;mso-position-horizontal:left;mso-position-horizontal-relative:page;mso-position-vertical:absolute;mso-position-vertical-relative:text;mso-width-percent:0;mso-height-percent:0;mso-width-relative:margin;mso-height-relative:margin;v-text-anchor:middle" o:gfxdata="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" fillcolor="#f2f2f2 [3052]" strokecolor="black [3213]" strokeweight="1pt">
+                <w10:wrap anchorx="page"/>
+              </v:rect>
+            </w:pict>
+          </mc:Fallback>
+        </mc:AlternateContent>
+      </w:r>
+    </w:p>
+    <w:p>
+      <w:pPr>
+        <w:pBdr>
+          <w:bottom w:val="single" w:sz="4" w:space="1" w:color="7F7F7F" w:themeColor="text1" w:themeTint="80"/>
+        </w:pBdr>
+        <w:tabs>
+          <w:tab w:val="left" w:pos="6435"/>
+        </w:tabs>
+        <w:rPr>
+          <w:color w:val="FF0000"/>
+          <w:sz w:val="24"/>
+          <w:szCs w:val="24"/>
+        </w:rPr>
+      </w:pPr>
+      <w:r>
+        <w:rPr>
+          <w:b/>
+          <w:bCs/>
+          <w:color w:val="FF0000"/>
+          <w:sz w:val="24"/>
+          <w:szCs w:val="24"/>
+        </w:rPr>
+        <w:t>RESPUESTA</w:t>
+      </w:r>
+    </w:p>
+    <w:p>
+      <w:pPr>
+        <w:spacing w:line="240" w:lineRule="auto"/>
+        <w:rPr>
+          <w:b/>
+          <w:bCs/>
+        </w:rPr>
+      </w:pPr>
+      <w:r>
+        <w:rPr>
+          <w:b/>
+          <w:bCs/>
+        </w:rPr>
+        <w:t>Consulta SQL</w:t>
+      </w:r>
+    </w:p>
+    <w:p>
+      <w:pPr>
+        <w:spacing w:after="0" w:line="240" w:lineRule="auto"/>
+        <w:rPr>
+          <w:rFonts w:ascii="Courier New" w:hAnsi="Courier New" w:cs="Courier New"/>
+        </w:rPr>
+      </w:pPr>
+      <w:r>
+        <w:rPr>
+          <w:rFonts w:ascii="Courier New" w:hAnsi="Courier New" w:cs="Courier New"/>
+        </w:rPr>
+        <w:t xml:space="preserve">UPDATE cursos SET </w:t>
+      </w:r>
+      <w:proofErr w:type="spellStart"/>
+      <w:r>
+        <w:rPr>
+          <w:rFonts w:ascii="Courier New" w:hAnsi="Courier New" w:cs="Courier New"/>
+        </w:rPr>
+        <w:t>max_alumn</w:t>
+      </w:r>
+      <w:proofErr w:type="spellEnd"/>
+      <w:r>
+        <w:rPr>
+          <w:rFonts w:ascii="Courier New" w:hAnsi="Courier New" w:cs="Courier New"/>
+        </w:rPr>
+        <w:t xml:space="preserve"> = (</w:t>
+      </w:r>
+    </w:p>
+    <w:p>
+      <w:pPr>
+        <w:spacing w:after="0" w:line="240" w:lineRule="auto"/>
+        <w:rPr>
+          <w:rFonts w:ascii="Courier New" w:hAnsi="Courier New" w:cs="Courier New"/>
+        </w:rPr>
+      </w:pPr>
+      <w:r>
+        <w:rPr>
+          <w:rFonts w:ascii="Courier New" w:hAnsi="Courier New" w:cs="Courier New"/>
+        </w:rPr>
+        <w:t xml:space="preserve">    SELECT </w:t>
+      </w:r>
+      <w:proofErr w:type="gramStart"/>
+      <w:r>
+        <w:rPr>
+          <w:rFonts w:ascii="Courier New" w:hAnsi="Courier New" w:cs="Courier New"/>
+        </w:rPr>
+        <w:t>COUNT(</w:t>
+      </w:r>
+      <w:proofErr w:type="spellStart"/>
+      <w:proofErr w:type="gramEnd"/>
+      <w:r>
+        <w:rPr>
+          <w:rFonts w:ascii="Courier New" w:hAnsi="Courier New" w:cs="Courier New"/>
+        </w:rPr>
+        <w:t>codigo</w:t>
+      </w:r>
+      <w:proofErr w:type="spellEnd"/>
+      <w:r>
+        <w:rPr>
+          <w:rFonts w:ascii="Courier New" w:hAnsi="Courier New" w:cs="Courier New"/>
+        </w:rPr>
+        <w:t xml:space="preserve">) FROM alumnado WHERE </w:t>
+      </w:r>
+      <w:proofErr w:type="spellStart"/>
+      <w:r>
+        <w:rPr>
+          <w:rFonts w:ascii="Courier New" w:hAnsi="Courier New" w:cs="Courier New"/>
+        </w:rPr>
+        <w:t>cod_curso</w:t>
+      </w:r>
+      <w:proofErr w:type="spellEnd"/>
+      <w:r>
+        <w:rPr>
+          <w:rFonts w:ascii="Courier New" w:hAnsi="Courier New" w:cs="Courier New"/>
+        </w:rPr>
+        <w:t xml:space="preserve"> = 2</w:t>
+      </w:r>
+    </w:p>
+    <w:p>
+      <w:pPr>
+        <w:spacing w:line="240" w:lineRule="auto"/>
+        <w:rPr>
+          <w:rFonts w:ascii="Courier New" w:hAnsi="Courier New" w:cs="Courier New"/>
+        </w:rPr>
+      </w:pPr>
+      <w:r>
+        <w:rPr>
+          <w:rFonts w:ascii="Courier New" w:hAnsi="Courier New" w:cs="Courier New"/>
+        </w:rPr>
+        <w:t xml:space="preserve">) WHERE </w:t>
+      </w:r>
+      <w:proofErr w:type="spellStart"/>
+      <w:r>
+        <w:rPr>
+          <w:rFonts w:ascii="Courier New" w:hAnsi="Courier New" w:cs="Courier New"/>
+        </w:rPr>
+        <w:t>codigo</w:t>
+      </w:r>
+      <w:proofErr w:type="spellEnd"/>
+      <w:r>
+        <w:rPr>
+          <w:rFonts w:ascii="Courier New" w:hAnsi="Courier New" w:cs="Courier New"/>
+        </w:rPr>
+        <w:t xml:space="preserve"> = 2;</w:t>
+      </w:r>
+    </w:p>
+    <w:p>
+      <w:pPr>
+        <w:spacing w:line="240" w:lineRule="auto"/>
+      </w:pPr>
+    </w:p>
+    <w:p>
+      <w:pPr>
+        <w:spacing w:line="240" w:lineRule="auto"/>
+      </w:pPr>
     </w:p>
     <w:p>
       <w:pPr>
@@ -4039,12 +4673,265 @@
         <w:spacing w:line="240" w:lineRule="auto"/>
         <w:ind w:left="714" w:hanging="357"/>
         <w:contextualSpacing w:val="0"/>
-      </w:pPr>
-      <w:r>
+        <w:rPr>
+          <w:color w:val="7F7F7F" w:themeColor="text1" w:themeTint="80"/>
+        </w:rPr>
+      </w:pPr>
+      <w:r>
+        <w:rPr>
+          <w:color w:val="7F7F7F" w:themeColor="text1" w:themeTint="80"/>
+        </w:rPr>
         <w:t>Elimina de la tabla ALUMNADO todos los registros asociados a los cursos que imparte la profesora cuyo nombre es "NURIA".</w:t>
       </w:r>
     </w:p>
-    <w:p/>
+    <w:p>
+      <w:pPr>
+        <w:spacing w:line="240" w:lineRule="auto"/>
+      </w:pPr>
+      <w:r>
+        <w:rPr>
+          <w:noProof/>
+        </w:rPr>
+        <mc:AlternateContent>
+          <mc:Choice Requires="wps">
+            <w:drawing>
+              <wp:anchor distT="0" distB="0" distL="114300" distR="114300" simplePos="0" relativeHeight="251677696" behindDoc="1" locked="0" layoutInCell="1" allowOverlap="1" wp14:anchorId="289C0801" wp14:editId="04EBD6D3">
+                <wp:simplePos x="0" y="0"/>
+                <wp:positionH relativeFrom="page">
+                  <wp:align>left</wp:align>
+                </wp:positionH>
+                <wp:positionV relativeFrom="paragraph">
+                  <wp:posOffset>33655</wp:posOffset>
+                </wp:positionV>
+                <wp:extent cx="7572375" cy="1609725"/>
+                <wp:effectExtent l="0" t="0" r="28575" b="28575"/>
+                <wp:wrapNone/>
+                <wp:docPr id="17" name="Rectángulo 17"/>
+                <wp:cNvGraphicFramePr/>
+                <a:graphic xmlns:a="http://schemas.openxmlformats.org/drawingml/2006/main">
+                  <a:graphicData uri="http://schemas.microsoft.com/office/word/2010/wordprocessingShape">
+                    <wps:wsp>
+                      <wps:cNvSpPr/>
+                      <wps:spPr>
+                        <a:xfrm>
+                          <a:off x="0" y="0"/>
+                          <a:ext cx="7572375" cy="1609725"/>
+                        </a:xfrm>
+                        <a:prstGeom prst="rect">
+                          <a:avLst/>
+                        </a:prstGeom>
+                        <a:solidFill>
+                          <a:schemeClr val="bg1">
+                            <a:lumMod val="95000"/>
+                          </a:schemeClr>
+                        </a:solidFill>
+                        <a:ln cmpd="sng">
+                          <a:solidFill>
+                            <a:schemeClr val="tx1"/>
+                          </a:solidFill>
+                        </a:ln>
+                      </wps:spPr>
+                      <wps:style>
+                        <a:lnRef idx="2">
+                          <a:schemeClr val="accent1">
+                            <a:shade val="50000"/>
+                          </a:schemeClr>
+                        </a:lnRef>
+                        <a:fillRef idx="1">
+                          <a:schemeClr val="accent1"/>
+                        </a:fillRef>
+                        <a:effectRef idx="0">
+                          <a:schemeClr val="accent1"/>
+                        </a:effectRef>
+                        <a:fontRef idx="minor">
+                          <a:schemeClr val="lt1"/>
+                        </a:fontRef>
+                      </wps:style>
+                      <wps:bodyPr rot="0" spcFirstLastPara="0" vertOverflow="overflow" horzOverflow="overflow" vert="horz" wrap="square" lIns="91440" tIns="45720" rIns="91440" bIns="45720" numCol="1" spcCol="0" rtlCol="0" fromWordArt="0" anchor="ctr" anchorCtr="0" forceAA="0" compatLnSpc="1">
+                        <a:prstTxWarp prst="textNoShape">
+                          <a:avLst/>
+                        </a:prstTxWarp>
+                        <a:noAutofit/>
+                      </wps:bodyPr>
+                    </wps:wsp>
+                  </a:graphicData>
+                </a:graphic>
+                <wp14:sizeRelH relativeFrom="margin">
+                  <wp14:pctWidth>0</wp14:pctWidth>
+                </wp14:sizeRelH>
+                <wp14:sizeRelV relativeFrom="margin">
+                  <wp14:pctHeight>0</wp14:pctHeight>
+                </wp14:sizeRelV>
+              </wp:anchor>
+            </w:drawing>
+          </mc:Choice>
+          <mc:Fallback>
+            <w:pict>
+              <v:rect w14:anchorId="017C7C04" id="Rectángulo 17" o:spid="_x0000_s1026" style="position:absolute;margin-left:0;margin-top:2.65pt;width:596.25pt;height:126.75pt;z-index:-251638784;visibility:visible;mso-wrap-style:square;mso-width-percent:0;mso-height-percent:0;mso-wrap-distance-left:9pt;mso-wrap-distance-top:0;mso-wrap-distance-right:9pt;mso-wrap-distance-bottom:0;mso-position-horizontal:left;mso-position-horizontal-relative:page;mso-position-vertical:absolute;mso-position-vertical-relative:text;mso-width-percent:0;mso-height-percent:0;mso-width-relative:margin;mso-height-relative:margin;v-text-anchor:middle" o:gfxdata="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" fillcolor="#f2f2f2 [3052]" strokecolor="black [3213]" strokeweight="1pt">
+                <w10:wrap anchorx="page"/>
+              </v:rect>
+            </w:pict>
+          </mc:Fallback>
+        </mc:AlternateContent>
+      </w:r>
+    </w:p>
+    <w:p>
+      <w:pPr>
+        <w:pBdr>
+          <w:bottom w:val="single" w:sz="4" w:space="1" w:color="7F7F7F" w:themeColor="text1" w:themeTint="80"/>
+        </w:pBdr>
+        <w:tabs>
+          <w:tab w:val="left" w:pos="6435"/>
+        </w:tabs>
+        <w:rPr>
+          <w:color w:val="FF0000"/>
+          <w:sz w:val="24"/>
+          <w:szCs w:val="24"/>
+        </w:rPr>
+      </w:pPr>
+      <w:r>
+        <w:rPr>
+          <w:b/>
+          <w:bCs/>
+          <w:color w:val="FF0000"/>
+          <w:sz w:val="24"/>
+          <w:szCs w:val="24"/>
+        </w:rPr>
+        <w:t>RESPUESTA</w:t>
+      </w:r>
+    </w:p>
+    <w:p>
+      <w:pPr>
+        <w:spacing w:line="240" w:lineRule="auto"/>
+        <w:rPr>
+          <w:b/>
+          <w:bCs/>
+        </w:rPr>
+      </w:pPr>
+      <w:r>
+        <w:rPr>
+          <w:b/>
+          <w:bCs/>
+        </w:rPr>
+        <w:t>Consulta SQL</w:t>
+      </w:r>
+    </w:p>
+    <w:p>
+      <w:pPr>
+        <w:spacing w:after="0" w:line="240" w:lineRule="auto"/>
+        <w:rPr>
+          <w:rFonts w:ascii="Courier New" w:hAnsi="Courier New" w:cs="Courier New"/>
+        </w:rPr>
+      </w:pPr>
+      <w:r>
+        <w:rPr>
+          <w:rFonts w:ascii="Courier New" w:hAnsi="Courier New" w:cs="Courier New"/>
+        </w:rPr>
+        <w:t xml:space="preserve">DELETE FROM alumnado WHERE </w:t>
+      </w:r>
+      <w:proofErr w:type="spellStart"/>
+      <w:r>
+        <w:rPr>
+          <w:rFonts w:ascii="Courier New" w:hAnsi="Courier New" w:cs="Courier New"/>
+        </w:rPr>
+        <w:t>cod_curso</w:t>
+      </w:r>
+      <w:proofErr w:type="spellEnd"/>
+      <w:r>
+        <w:rPr>
+          <w:rFonts w:ascii="Courier New" w:hAnsi="Courier New" w:cs="Courier New"/>
+        </w:rPr>
+        <w:t xml:space="preserve"> IN (</w:t>
+      </w:r>
+    </w:p>
+    <w:p>
+      <w:pPr>
+        <w:spacing w:after="0" w:line="240" w:lineRule="auto"/>
+        <w:rPr>
+          <w:rFonts w:ascii="Courier New" w:hAnsi="Courier New" w:cs="Courier New"/>
+        </w:rPr>
+      </w:pPr>
+      <w:r>
+        <w:rPr>
+          <w:rFonts w:ascii="Courier New" w:hAnsi="Courier New" w:cs="Courier New"/>
+        </w:rPr>
+        <w:t xml:space="preserve">  SELECT </w:t>
+      </w:r>
+      <w:proofErr w:type="spellStart"/>
+      <w:proofErr w:type="gramStart"/>
+      <w:r>
+        <w:rPr>
+          <w:rFonts w:ascii="Courier New" w:hAnsi="Courier New" w:cs="Courier New"/>
+        </w:rPr>
+        <w:t>c.codigo</w:t>
+      </w:r>
+      <w:proofErr w:type="spellEnd"/>
+      <w:proofErr w:type="gramEnd"/>
+      <w:r>
+        <w:rPr>
+          <w:rFonts w:ascii="Courier New" w:hAnsi="Courier New" w:cs="Courier New"/>
+        </w:rPr>
+        <w:t xml:space="preserve"> FROM cursos c, profesorado p</w:t>
+      </w:r>
+    </w:p>
+    <w:p>
+      <w:pPr>
+        <w:spacing w:line="240" w:lineRule="auto"/>
+        <w:rPr>
+          <w:rFonts w:ascii="Courier New" w:hAnsi="Courier New" w:cs="Courier New"/>
+        </w:rPr>
+      </w:pPr>
+      <w:r>
+        <w:rPr>
+          <w:rFonts w:ascii="Courier New" w:hAnsi="Courier New" w:cs="Courier New"/>
+        </w:rPr>
+        <w:t xml:space="preserve">  WHERE </w:t>
+      </w:r>
+      <w:proofErr w:type="spellStart"/>
+      <w:r>
+        <w:rPr>
+          <w:rFonts w:ascii="Courier New" w:hAnsi="Courier New" w:cs="Courier New"/>
+        </w:rPr>
+        <w:t>c.cod_profe</w:t>
+      </w:r>
+      <w:proofErr w:type="spellEnd"/>
+      <w:r>
+        <w:rPr>
+          <w:rFonts w:ascii="Courier New" w:hAnsi="Courier New" w:cs="Courier New"/>
+        </w:rPr>
+        <w:t xml:space="preserve"> = </w:t>
+      </w:r>
+      <w:proofErr w:type="spellStart"/>
+      <w:proofErr w:type="gramStart"/>
+      <w:r>
+        <w:rPr>
+          <w:rFonts w:ascii="Courier New" w:hAnsi="Courier New" w:cs="Courier New"/>
+        </w:rPr>
+        <w:t>p.codigo</w:t>
+      </w:r>
+      <w:proofErr w:type="spellEnd"/>
+      <w:proofErr w:type="gramEnd"/>
+      <w:r>
+        <w:rPr>
+          <w:rFonts w:ascii="Courier New" w:hAnsi="Courier New" w:cs="Courier New"/>
+        </w:rPr>
+        <w:t xml:space="preserve"> AND </w:t>
+      </w:r>
+      <w:proofErr w:type="spellStart"/>
+      <w:r>
+        <w:rPr>
+          <w:rFonts w:ascii="Courier New" w:hAnsi="Courier New" w:cs="Courier New"/>
+        </w:rPr>
+        <w:t>p.nombre</w:t>
+      </w:r>
+      <w:proofErr w:type="spellEnd"/>
+      <w:r>
+        <w:rPr>
+          <w:rFonts w:ascii="Courier New" w:hAnsi="Courier New" w:cs="Courier New"/>
+        </w:rPr>
+        <w:t xml:space="preserve"> = 'NURIA');</w:t>
+      </w:r>
+    </w:p>
     <w:sectPr>
       <w:footerReference w:type="default" r:id="rId14"/>
       <w:pgSz w:w="11906" w:h="16838"/>

</xml_diff>